<commit_message>
Update certificate with Swayam's tasks; team total 146; rebuild Del4 PDF
Co-Authored-By: Claude Opus 5.5 <noreply@anthropic.com>
Claude-Session: https://claude.ai/code/session_01Mv543SavHJLpx6bYwafarE
</commit_message>
<xml_diff>
--- a/Documents/Group74_D4_Deliverable_Certificate.docx
+++ b/Documents/Group74_D4_Deliverable_Certificate.docx
@@ -1,6 +1,6 @@
 
 <file path=word/document.xml><?xml version="1.0" encoding="utf-8"?>
-<w:document xmlns:wpc="http://schemas.microsoft.com/office/word/2010/wordprocessingCanvas" xmlns:cx="http://schemas.microsoft.com/office/drawing/2014/chartex" xmlns:cx1="http://schemas.microsoft.com/office/drawing/2015/9/8/chartex" xmlns:cx2="http://schemas.microsoft.com/office/drawing/2015/10/21/chartex" xmlns:cx3="http://schemas.microsoft.com/office/drawing/2016/5/9/chartex" xmlns:cx4="http://schemas.microsoft.com/office/drawing/2016/5/10/chartex" xmlns:cx5="http://schemas.microsoft.com/office/drawing/2016/5/11/chartex" xmlns:cx6="http://schemas.microsoft.com/office/drawing/2016/5/12/chartex" xmlns:cx7="http://schemas.microsoft.com/office/drawing/2016/5/13/chartex" xmlns:cx8="http://schemas.microsoft.com/office/drawing/2016/5/14/chartex" xmlns:mc="http://schemas.openxmlformats.org/markup-compatibility/2006" xmlns:m="http://schemas.openxmlformats.org/officeDocument/2006/math" xmlns:aink="http://schemas.microsoft.com/office/drawing/2016/ink" xmlns:am3d="http://schemas.microsoft.com/office/drawing/2017/model3d" xmlns:oel="http://schemas.microsoft.com/office/2019/extlst" xmlns:r="http://schemas.openxmlformats.org/officeDocument/2006/relationships" xmlns:wp14="http://schemas.microsoft.com/office/word/2010/wordprocessingDrawing" xmlns:wp="http://schemas.openxmlformats.org/drawingml/2006/wordprocessingDrawing" xmlns:wpg="http://schemas.microsoft.com/office/word/2010/wordprocessingGroup" xmlns:wpi="http://schemas.microsoft.com/office/word/2010/wordprocessingInk" xmlns:wps="http://schemas.microsoft.com/office/word/2010/wordprocessingShape" xmlns:o="urn:schemas-microsoft-com:office:office" xmlns:v="urn:schemas-microsoft-com:vml" xmlns:w10="urn:schemas-microsoft-com:office:word" xmlns:w="http://schemas.openxmlformats.org/wordprocessingml/2006/main" xmlns:w14="http://schemas.microsoft.com/office/word/2010/wordml" xmlns:w15="http://schemas.microsoft.com/office/word/2012/wordml" xmlns:w16cex="http://schemas.microsoft.com/office/word/2018/wordml/cex" xmlns:w16cid="http://schemas.microsoft.com/office/word/2016/wordml/cid" xmlns:w16="http://schemas.microsoft.com/office/word/2018/wordml" xmlns:w16sdtdh="http://schemas.microsoft.com/office/word/2020/wordml/sdtdatahash" xmlns:w16sdtfl="http://schemas.microsoft.com/office/word/2024/wordml/sdtformatlock" xmlns:w16se="http://schemas.microsoft.com/office/word/2015/wordml/symex" xmlns:w16du="http://schemas.microsoft.com/office/word/2023/wordml/word16du" xmlns:wne="http://schemas.microsoft.com/office/word/2006/wordml" mc:Ignorable="w14 w15 w16se w16cid w16 w16cex w16sdtdh w16sdtfl w16du wp14">
+<w:document xmlns:wpc="http://schemas.microsoft.com/office/word/2010/wordprocessingCanvas" xmlns:cx="http://schemas.microsoft.com/office/drawing/2014/chartex" xmlns:cx1="http://schemas.microsoft.com/office/drawing/2015/9/8/chartex" xmlns:mc="http://schemas.openxmlformats.org/markup-compatibility/2006" xmlns:o="urn:schemas-microsoft-com:office:office" xmlns:r="http://schemas.openxmlformats.org/officeDocument/2006/relationships" xmlns:m="http://schemas.openxmlformats.org/officeDocument/2006/math" xmlns:v="urn:schemas-microsoft-com:vml" xmlns:wp14="http://schemas.microsoft.com/office/word/2010/wordprocessingDrawing" xmlns:wp="http://schemas.openxmlformats.org/drawingml/2006/wordprocessingDrawing" xmlns:w10="urn:schemas-microsoft-com:office:word" xmlns:w="http://schemas.openxmlformats.org/wordprocessingml/2006/main" xmlns:w14="http://schemas.microsoft.com/office/word/2010/wordml" xmlns:w15="http://schemas.microsoft.com/office/word/2012/wordml" xmlns:w16se="http://schemas.microsoft.com/office/word/2015/wordml/symex" xmlns:wpg="http://schemas.microsoft.com/office/word/2010/wordprocessingGroup" xmlns:wpi="http://schemas.microsoft.com/office/word/2010/wordprocessingInk" xmlns:wne="http://schemas.microsoft.com/office/word/2006/wordml" xmlns:wps="http://schemas.microsoft.com/office/word/2010/wordprocessingShape" mc:Ignorable="w14 w15 w16se wp14">
   <w:body>
     <w:p>
       <w:pPr>
@@ -836,7 +836,14 @@
             <w:tcW w:w="2494" w:type="dxa"/>
             <w:vAlign w:val="center"/>
           </w:tcPr>
-          <w:p/>
+          <w:p>
+            <w:pPr>
+              <w:jc w:val="center"/>
+            </w:pPr>
+            <w:r>
+              <w:t>SK</w:t>
+            </w:r>
+          </w:p>
         </w:tc>
       </w:tr>
       <w:tr>
@@ -1429,15 +1436,7 @@
           </w:tcPr>
           <w:p>
             <w:r>
-              <w:t xml:space="preserve">Implemented SVM and </w:t>
-            </w:r>
-            <w:proofErr w:type="spellStart"/>
-            <w:r>
-              <w:t>XGBoost</w:t>
-            </w:r>
-            <w:proofErr w:type="spellEnd"/>
-            <w:r>
-              <w:t xml:space="preserve"> linkage models; completed the five-model comparison on structured data</w:t>
+              <w:t>Implemented SVM and XGBoost linkage models; completed the five-model comparison on structured data</w:t>
             </w:r>
           </w:p>
         </w:tc>
@@ -1974,6 +1973,219 @@
           <w:p>
             <w:r>
               <w:t>Updated Scoping Document, Feasibility Report using feedback and the latest MVP progress.</w:t>
+            </w:r>
+          </w:p>
+        </w:tc>
+        <w:tc>
+          <w:tcPr>
+            <w:tcW w:w="1161" w:type="dxa"/>
+            <w:vAlign w:val="center"/>
+          </w:tcPr>
+          <w:p/>
+        </w:tc>
+      </w:tr>
+      <w:tr>
+        <w:tc>
+          <w:tcPr>
+            <w:tcW w:w="2405" w:type="dxa"/>
+            <w:vAlign w:val="center"/>
+          </w:tcPr>
+          <w:p>
+            <w:r>
+              <w:t>Swayam Kaushik</w:t>
+            </w:r>
+          </w:p>
+        </w:tc>
+        <w:tc>
+          <w:tcPr>
+            <w:tcW w:w="851" w:type="dxa"/>
+            <w:vAlign w:val="center"/>
+          </w:tcPr>
+          <w:p>
+            <w:r>
+              <w:t>2</w:t>
+            </w:r>
+          </w:p>
+        </w:tc>
+        <w:tc>
+          <w:tcPr>
+            <w:tcW w:w="850" w:type="dxa"/>
+            <w:vAlign w:val="center"/>
+          </w:tcPr>
+          <w:p>
+            <w:r>
+              <w:t>M</w:t>
+            </w:r>
+          </w:p>
+        </w:tc>
+        <w:tc>
+          <w:tcPr>
+            <w:tcW w:w="3761" w:type="dxa"/>
+            <w:vAlign w:val="center"/>
+          </w:tcPr>
+          <w:p>
+            <w:r>
+              <w:t>Updated the scoping document</w:t>
+            </w:r>
+          </w:p>
+        </w:tc>
+        <w:tc>
+          <w:tcPr>
+            <w:tcW w:w="1161" w:type="dxa"/>
+            <w:vAlign w:val="center"/>
+          </w:tcPr>
+          <w:p/>
+        </w:tc>
+      </w:tr>
+      <w:tr>
+        <w:tc>
+          <w:tcPr>
+            <w:tcW w:w="2405" w:type="dxa"/>
+            <w:vAlign w:val="center"/>
+          </w:tcPr>
+          <w:p>
+            <w:r>
+              <w:t>Swayam Kaushik</w:t>
+            </w:r>
+          </w:p>
+        </w:tc>
+        <w:tc>
+          <w:tcPr>
+            <w:tcW w:w="851" w:type="dxa"/>
+            <w:vAlign w:val="center"/>
+          </w:tcPr>
+          <w:p>
+            <w:r>
+              <w:t>4</w:t>
+            </w:r>
+          </w:p>
+        </w:tc>
+        <w:tc>
+          <w:tcPr>
+            <w:tcW w:w="850" w:type="dxa"/>
+            <w:vAlign w:val="center"/>
+          </w:tcPr>
+          <w:p>
+            <w:r>
+              <w:t>M</w:t>
+            </w:r>
+          </w:p>
+        </w:tc>
+        <w:tc>
+          <w:tcPr>
+            <w:tcW w:w="3761" w:type="dxa"/>
+            <w:vAlign w:val="center"/>
+          </w:tcPr>
+          <w:p>
+            <w:r>
+              <w:t>Working on Deliverable 3</w:t>
+            </w:r>
+          </w:p>
+        </w:tc>
+        <w:tc>
+          <w:tcPr>
+            <w:tcW w:w="1161" w:type="dxa"/>
+            <w:vAlign w:val="center"/>
+          </w:tcPr>
+          <w:p/>
+        </w:tc>
+      </w:tr>
+      <w:tr>
+        <w:tc>
+          <w:tcPr>
+            <w:tcW w:w="2405" w:type="dxa"/>
+            <w:vAlign w:val="center"/>
+          </w:tcPr>
+          <w:p>
+            <w:r>
+              <w:lastRenderedPageBreak/>
+              <w:t>Swayam Kaushik</w:t>
+            </w:r>
+          </w:p>
+        </w:tc>
+        <w:tc>
+          <w:tcPr>
+            <w:tcW w:w="851" w:type="dxa"/>
+            <w:vAlign w:val="center"/>
+          </w:tcPr>
+          <w:p>
+            <w:r>
+              <w:t>4</w:t>
+            </w:r>
+          </w:p>
+        </w:tc>
+        <w:tc>
+          <w:tcPr>
+            <w:tcW w:w="850" w:type="dxa"/>
+            <w:vAlign w:val="center"/>
+          </w:tcPr>
+          <w:p>
+            <w:r>
+              <w:t>M</w:t>
+            </w:r>
+          </w:p>
+        </w:tc>
+        <w:tc>
+          <w:tcPr>
+            <w:tcW w:w="3761" w:type="dxa"/>
+            <w:vAlign w:val="center"/>
+          </w:tcPr>
+          <w:p>
+            <w:r>
+              <w:t>Generated on all test result and figures.</w:t>
+            </w:r>
+          </w:p>
+        </w:tc>
+        <w:tc>
+          <w:tcPr>
+            <w:tcW w:w="1161" w:type="dxa"/>
+            <w:vAlign w:val="center"/>
+          </w:tcPr>
+          <w:p/>
+        </w:tc>
+      </w:tr>
+      <w:tr>
+        <w:tc>
+          <w:tcPr>
+            <w:tcW w:w="2405" w:type="dxa"/>
+            <w:vAlign w:val="center"/>
+          </w:tcPr>
+          <w:p>
+            <w:r>
+              <w:t>Swayam Kaushik</w:t>
+            </w:r>
+          </w:p>
+        </w:tc>
+        <w:tc>
+          <w:tcPr>
+            <w:tcW w:w="851" w:type="dxa"/>
+            <w:vAlign w:val="center"/>
+          </w:tcPr>
+          <w:p>
+            <w:r>
+              <w:t>6</w:t>
+            </w:r>
+          </w:p>
+        </w:tc>
+        <w:tc>
+          <w:tcPr>
+            <w:tcW w:w="850" w:type="dxa"/>
+            <w:vAlign w:val="center"/>
+          </w:tcPr>
+          <w:p>
+            <w:r>
+              <w:t>M</w:t>
+            </w:r>
+          </w:p>
+        </w:tc>
+        <w:tc>
+          <w:tcPr>
+            <w:tcW w:w="3761" w:type="dxa"/>
+            <w:vAlign w:val="center"/>
+          </w:tcPr>
+          <w:p>
+            <w:r>
+              <w:t>Prepared the report on the basis of feedbacks for Deliverable 2 and 3.</w:t>
             </w:r>
           </w:p>
         </w:tc>
@@ -2120,7 +2332,6 @@
               <w:rPr>
                 <w:b/>
               </w:rPr>
-              <w:lastRenderedPageBreak/>
               <w:t>Swayam Kaushik — Total</w:t>
             </w:r>
           </w:p>
@@ -2130,7 +2341,21 @@
             <w:tcW w:w="851" w:type="dxa"/>
             <w:vAlign w:val="center"/>
           </w:tcPr>
-          <w:p/>
+          <w:p>
+            <w:pPr>
+              <w:rPr>
+                <w:b/>
+              </w:rPr>
+            </w:pPr>
+            <w:r>
+              <w:rPr>
+                <w:b/>
+              </w:rPr>
+              <w:t>16</w:t>
+            </w:r>
+            <w:bookmarkStart w:id="0" w:name="_GoBack"/>
+            <w:bookmarkEnd w:id="0"/>
+          </w:p>
         </w:tc>
         <w:tc>
           <w:tcPr>
@@ -2537,7 +2762,7 @@
               <w:rPr>
                 <w:b/>
               </w:rPr>
-              <w:t>130</w:t>
+              <w:t>146</w:t>
             </w:r>
           </w:p>
         </w:tc>
@@ -2676,7 +2901,7 @@
 </file>
 
 <file path=word/endnotes.xml><?xml version="1.0" encoding="utf-8"?>
-<w:endnotes xmlns:wpc="http://schemas.microsoft.com/office/word/2010/wordprocessingCanvas" xmlns:cx="http://schemas.microsoft.com/office/drawing/2014/chartex" xmlns:cx1="http://schemas.microsoft.com/office/drawing/2015/9/8/chartex" xmlns:cx2="http://schemas.microsoft.com/office/drawing/2015/10/21/chartex" xmlns:cx3="http://schemas.microsoft.com/office/drawing/2016/5/9/chartex" xmlns:cx4="http://schemas.microsoft.com/office/drawing/2016/5/10/chartex" xmlns:cx5="http://schemas.microsoft.com/office/drawing/2016/5/11/chartex" xmlns:cx6="http://schemas.microsoft.com/office/drawing/2016/5/12/chartex" xmlns:cx7="http://schemas.microsoft.com/office/drawing/2016/5/13/chartex" xmlns:cx8="http://schemas.microsoft.com/office/drawing/2016/5/14/chartex" xmlns:mc="http://schemas.openxmlformats.org/markup-compatibility/2006" xmlns:m="http://schemas.openxmlformats.org/officeDocument/2006/math" xmlns:aink="http://schemas.microsoft.com/office/drawing/2016/ink" xmlns:am3d="http://schemas.microsoft.com/office/drawing/2017/model3d" xmlns:oel="http://schemas.microsoft.com/office/2019/extlst" xmlns:r="http://schemas.openxmlformats.org/officeDocument/2006/relationships" xmlns:wp14="http://schemas.microsoft.com/office/word/2010/wordprocessingDrawing" xmlns:wp="http://schemas.openxmlformats.org/drawingml/2006/wordprocessingDrawing" xmlns:wpg="http://schemas.microsoft.com/office/word/2010/wordprocessingGroup" xmlns:wpi="http://schemas.microsoft.com/office/word/2010/wordprocessingInk" xmlns:wps="http://schemas.microsoft.com/office/word/2010/wordprocessingShape" xmlns:o="urn:schemas-microsoft-com:office:office" xmlns:v="urn:schemas-microsoft-com:vml" xmlns:w10="urn:schemas-microsoft-com:office:word" xmlns:w="http://schemas.openxmlformats.org/wordprocessingml/2006/main" xmlns:w14="http://schemas.microsoft.com/office/word/2010/wordml" xmlns:w15="http://schemas.microsoft.com/office/word/2012/wordml" xmlns:w16cex="http://schemas.microsoft.com/office/word/2018/wordml/cex" xmlns:w16cid="http://schemas.microsoft.com/office/word/2016/wordml/cid" xmlns:w16="http://schemas.microsoft.com/office/word/2018/wordml" xmlns:w16sdtdh="http://schemas.microsoft.com/office/word/2020/wordml/sdtdatahash" xmlns:w16sdtfl="http://schemas.microsoft.com/office/word/2024/wordml/sdtformatlock" xmlns:w16se="http://schemas.microsoft.com/office/word/2015/wordml/symex" xmlns:w16du="http://schemas.microsoft.com/office/word/2023/wordml/word16du" xmlns:wne="http://schemas.microsoft.com/office/word/2006/wordml" mc:Ignorable="w14 w15 w16se w16cid w16 w16cex w16sdtdh w16sdtfl w16du wp14">
+<w:endnotes xmlns:wpc="http://schemas.microsoft.com/office/word/2010/wordprocessingCanvas" xmlns:cx="http://schemas.microsoft.com/office/drawing/2014/chartex" xmlns:cx1="http://schemas.microsoft.com/office/drawing/2015/9/8/chartex" xmlns:mc="http://schemas.openxmlformats.org/markup-compatibility/2006" xmlns:o="urn:schemas-microsoft-com:office:office" xmlns:r="http://schemas.openxmlformats.org/officeDocument/2006/relationships" xmlns:m="http://schemas.openxmlformats.org/officeDocument/2006/math" xmlns:v="urn:schemas-microsoft-com:vml" xmlns:wp14="http://schemas.microsoft.com/office/word/2010/wordprocessingDrawing" xmlns:wp="http://schemas.openxmlformats.org/drawingml/2006/wordprocessingDrawing" xmlns:w10="urn:schemas-microsoft-com:office:word" xmlns:w="http://schemas.openxmlformats.org/wordprocessingml/2006/main" xmlns:w14="http://schemas.microsoft.com/office/word/2010/wordml" xmlns:w15="http://schemas.microsoft.com/office/word/2012/wordml" xmlns:w16se="http://schemas.microsoft.com/office/word/2015/wordml/symex" xmlns:wpg="http://schemas.microsoft.com/office/word/2010/wordprocessingGroup" xmlns:wpi="http://schemas.microsoft.com/office/word/2010/wordprocessingInk" xmlns:wne="http://schemas.microsoft.com/office/word/2006/wordml" xmlns:wps="http://schemas.microsoft.com/office/word/2010/wordprocessingShape" mc:Ignorable="w14 w15 w16se wp14">
   <w:endnote w:type="separator" w:id="-1">
     <w:p>
       <w:r>
@@ -2695,7 +2920,7 @@
 </file>
 
 <file path=word/footer1.xml><?xml version="1.0" encoding="utf-8"?>
-<w:ftr xmlns:wpc="http://schemas.microsoft.com/office/word/2010/wordprocessingCanvas" xmlns:cx="http://schemas.microsoft.com/office/drawing/2014/chartex" xmlns:cx1="http://schemas.microsoft.com/office/drawing/2015/9/8/chartex" xmlns:cx2="http://schemas.microsoft.com/office/drawing/2015/10/21/chartex" xmlns:cx3="http://schemas.microsoft.com/office/drawing/2016/5/9/chartex" xmlns:cx4="http://schemas.microsoft.com/office/drawing/2016/5/10/chartex" xmlns:cx5="http://schemas.microsoft.com/office/drawing/2016/5/11/chartex" xmlns:cx6="http://schemas.microsoft.com/office/drawing/2016/5/12/chartex" xmlns:cx7="http://schemas.microsoft.com/office/drawing/2016/5/13/chartex" xmlns:cx8="http://schemas.microsoft.com/office/drawing/2016/5/14/chartex" xmlns:mc="http://schemas.openxmlformats.org/markup-compatibility/2006" xmlns:m="http://schemas.openxmlformats.org/officeDocument/2006/math" xmlns:aink="http://schemas.microsoft.com/office/drawing/2016/ink" xmlns:am3d="http://schemas.microsoft.com/office/drawing/2017/model3d" xmlns:oel="http://schemas.microsoft.com/office/2019/extlst" xmlns:r="http://schemas.openxmlformats.org/officeDocument/2006/relationships" xmlns:wp14="http://schemas.microsoft.com/office/word/2010/wordprocessingDrawing" xmlns:wp="http://schemas.openxmlformats.org/drawingml/2006/wordprocessingDrawing" xmlns:wpg="http://schemas.microsoft.com/office/word/2010/wordprocessingGroup" xmlns:wpi="http://schemas.microsoft.com/office/word/2010/wordprocessingInk" xmlns:wps="http://schemas.microsoft.com/office/word/2010/wordprocessingShape" xmlns:o="urn:schemas-microsoft-com:office:office" xmlns:v="urn:schemas-microsoft-com:vml" xmlns:w10="urn:schemas-microsoft-com:office:word" xmlns:w="http://schemas.openxmlformats.org/wordprocessingml/2006/main" xmlns:w14="http://schemas.microsoft.com/office/word/2010/wordml" xmlns:w15="http://schemas.microsoft.com/office/word/2012/wordml" xmlns:w16cex="http://schemas.microsoft.com/office/word/2018/wordml/cex" xmlns:w16cid="http://schemas.microsoft.com/office/word/2016/wordml/cid" xmlns:w16="http://schemas.microsoft.com/office/word/2018/wordml" xmlns:w16sdtdh="http://schemas.microsoft.com/office/word/2020/wordml/sdtdatahash" xmlns:w16sdtfl="http://schemas.microsoft.com/office/word/2024/wordml/sdtformatlock" xmlns:w16se="http://schemas.microsoft.com/office/word/2015/wordml/symex" xmlns:w16du="http://schemas.microsoft.com/office/word/2023/wordml/word16du" xmlns:wne="http://schemas.microsoft.com/office/word/2006/wordml" mc:Ignorable="w14 w15 w16se w16cid w16 w16cex w16sdtdh w16sdtfl w16du wp14">
+<w:ftr xmlns:wpc="http://schemas.microsoft.com/office/word/2010/wordprocessingCanvas" xmlns:cx="http://schemas.microsoft.com/office/drawing/2014/chartex" xmlns:cx1="http://schemas.microsoft.com/office/drawing/2015/9/8/chartex" xmlns:mc="http://schemas.openxmlformats.org/markup-compatibility/2006" xmlns:o="urn:schemas-microsoft-com:office:office" xmlns:r="http://schemas.openxmlformats.org/officeDocument/2006/relationships" xmlns:m="http://schemas.openxmlformats.org/officeDocument/2006/math" xmlns:v="urn:schemas-microsoft-com:vml" xmlns:wp14="http://schemas.microsoft.com/office/word/2010/wordprocessingDrawing" xmlns:wp="http://schemas.openxmlformats.org/drawingml/2006/wordprocessingDrawing" xmlns:w10="urn:schemas-microsoft-com:office:word" xmlns:w="http://schemas.openxmlformats.org/wordprocessingml/2006/main" xmlns:w14="http://schemas.microsoft.com/office/word/2010/wordml" xmlns:w15="http://schemas.microsoft.com/office/word/2012/wordml" xmlns:w16se="http://schemas.microsoft.com/office/word/2015/wordml/symex" xmlns:wpg="http://schemas.microsoft.com/office/word/2010/wordprocessingGroup" xmlns:wpi="http://schemas.microsoft.com/office/word/2010/wordprocessingInk" xmlns:wne="http://schemas.microsoft.com/office/word/2006/wordml" xmlns:wps="http://schemas.microsoft.com/office/word/2010/wordprocessingShape" mc:Ignorable="w14 w15 w16se wp14">
   <w:sdt>
     <w:sdtPr>
       <w:rPr>
@@ -2707,6 +2932,11 @@
         <w:docPartUnique/>
       </w:docPartObj>
     </w:sdtPr>
+    <w:sdtEndPr>
+      <w:rPr>
+        <w:rStyle w:val="PageNumber"/>
+      </w:rPr>
+    </w:sdtEndPr>
     <w:sdtContent>
       <w:p>
         <w:pPr>
@@ -2747,7 +2977,7 @@
 </file>
 
 <file path=word/footer2.xml><?xml version="1.0" encoding="utf-8"?>
-<w:ftr xmlns:wpc="http://schemas.microsoft.com/office/word/2010/wordprocessingCanvas" xmlns:cx="http://schemas.microsoft.com/office/drawing/2014/chartex" xmlns:cx1="http://schemas.microsoft.com/office/drawing/2015/9/8/chartex" xmlns:cx2="http://schemas.microsoft.com/office/drawing/2015/10/21/chartex" xmlns:cx3="http://schemas.microsoft.com/office/drawing/2016/5/9/chartex" xmlns:cx4="http://schemas.microsoft.com/office/drawing/2016/5/10/chartex" xmlns:cx5="http://schemas.microsoft.com/office/drawing/2016/5/11/chartex" xmlns:cx6="http://schemas.microsoft.com/office/drawing/2016/5/12/chartex" xmlns:cx7="http://schemas.microsoft.com/office/drawing/2016/5/13/chartex" xmlns:cx8="http://schemas.microsoft.com/office/drawing/2016/5/14/chartex" xmlns:mc="http://schemas.openxmlformats.org/markup-compatibility/2006" xmlns:m="http://schemas.openxmlformats.org/officeDocument/2006/math" xmlns:aink="http://schemas.microsoft.com/office/drawing/2016/ink" xmlns:am3d="http://schemas.microsoft.com/office/drawing/2017/model3d" xmlns:oel="http://schemas.microsoft.com/office/2019/extlst" xmlns:r="http://schemas.openxmlformats.org/officeDocument/2006/relationships" xmlns:wp14="http://schemas.microsoft.com/office/word/2010/wordprocessingDrawing" xmlns:wp="http://schemas.openxmlformats.org/drawingml/2006/wordprocessingDrawing" xmlns:wpg="http://schemas.microsoft.com/office/word/2010/wordprocessingGroup" xmlns:wpi="http://schemas.microsoft.com/office/word/2010/wordprocessingInk" xmlns:wps="http://schemas.microsoft.com/office/word/2010/wordprocessingShape" xmlns:o="urn:schemas-microsoft-com:office:office" xmlns:v="urn:schemas-microsoft-com:vml" xmlns:w10="urn:schemas-microsoft-com:office:word" xmlns:w="http://schemas.openxmlformats.org/wordprocessingml/2006/main" xmlns:w14="http://schemas.microsoft.com/office/word/2010/wordml" xmlns:w15="http://schemas.microsoft.com/office/word/2012/wordml" xmlns:w16cex="http://schemas.microsoft.com/office/word/2018/wordml/cex" xmlns:w16cid="http://schemas.microsoft.com/office/word/2016/wordml/cid" xmlns:w16="http://schemas.microsoft.com/office/word/2018/wordml" xmlns:w16sdtdh="http://schemas.microsoft.com/office/word/2020/wordml/sdtdatahash" xmlns:w16sdtfl="http://schemas.microsoft.com/office/word/2024/wordml/sdtformatlock" xmlns:w16se="http://schemas.microsoft.com/office/word/2015/wordml/symex" xmlns:w16du="http://schemas.microsoft.com/office/word/2023/wordml/word16du" xmlns:wne="http://schemas.microsoft.com/office/word/2006/wordml" mc:Ignorable="w14 w15 w16se w16cid w16 w16cex w16sdtdh w16sdtfl w16du wp14">
+<w:ftr xmlns:wpc="http://schemas.microsoft.com/office/word/2010/wordprocessingCanvas" xmlns:cx="http://schemas.microsoft.com/office/drawing/2014/chartex" xmlns:cx1="http://schemas.microsoft.com/office/drawing/2015/9/8/chartex" xmlns:mc="http://schemas.openxmlformats.org/markup-compatibility/2006" xmlns:o="urn:schemas-microsoft-com:office:office" xmlns:r="http://schemas.openxmlformats.org/officeDocument/2006/relationships" xmlns:m="http://schemas.openxmlformats.org/officeDocument/2006/math" xmlns:v="urn:schemas-microsoft-com:vml" xmlns:wp14="http://schemas.microsoft.com/office/word/2010/wordprocessingDrawing" xmlns:wp="http://schemas.openxmlformats.org/drawingml/2006/wordprocessingDrawing" xmlns:w10="urn:schemas-microsoft-com:office:word" xmlns:w="http://schemas.openxmlformats.org/wordprocessingml/2006/main" xmlns:w14="http://schemas.microsoft.com/office/word/2010/wordml" xmlns:w15="http://schemas.microsoft.com/office/word/2012/wordml" xmlns:w16se="http://schemas.microsoft.com/office/word/2015/wordml/symex" xmlns:wpg="http://schemas.microsoft.com/office/word/2010/wordprocessingGroup" xmlns:wpi="http://schemas.microsoft.com/office/word/2010/wordprocessingInk" xmlns:wne="http://schemas.microsoft.com/office/word/2006/wordml" xmlns:wps="http://schemas.microsoft.com/office/word/2010/wordprocessingShape" mc:Ignorable="w14 w15 w16se wp14">
   <w:sdt>
     <w:sdtPr>
       <w:rPr>
@@ -2759,6 +2989,11 @@
         <w:docPartUnique/>
       </w:docPartObj>
     </w:sdtPr>
+    <w:sdtEndPr>
+      <w:rPr>
+        <w:rStyle w:val="PageNumber"/>
+      </w:rPr>
+    </w:sdtEndPr>
     <w:sdtContent>
       <w:p>
         <w:pPr>
@@ -2791,7 +3026,7 @@
             <w:rStyle w:val="PageNumber"/>
             <w:noProof/>
           </w:rPr>
-          <w:t>ii</w:t>
+          <w:t>i</w:t>
         </w:r>
         <w:r>
           <w:rPr>
@@ -2839,7 +3074,7 @@
 </file>
 
 <file path=word/footnotes.xml><?xml version="1.0" encoding="utf-8"?>
-<w:footnotes xmlns:wpc="http://schemas.microsoft.com/office/word/2010/wordprocessingCanvas" xmlns:cx="http://schemas.microsoft.com/office/drawing/2014/chartex" xmlns:cx1="http://schemas.microsoft.com/office/drawing/2015/9/8/chartex" xmlns:cx2="http://schemas.microsoft.com/office/drawing/2015/10/21/chartex" xmlns:cx3="http://schemas.microsoft.com/office/drawing/2016/5/9/chartex" xmlns:cx4="http://schemas.microsoft.com/office/drawing/2016/5/10/chartex" xmlns:cx5="http://schemas.microsoft.com/office/drawing/2016/5/11/chartex" xmlns:cx6="http://schemas.microsoft.com/office/drawing/2016/5/12/chartex" xmlns:cx7="http://schemas.microsoft.com/office/drawing/2016/5/13/chartex" xmlns:cx8="http://schemas.microsoft.com/office/drawing/2016/5/14/chartex" xmlns:mc="http://schemas.openxmlformats.org/markup-compatibility/2006" xmlns:m="http://schemas.openxmlformats.org/officeDocument/2006/math" xmlns:aink="http://schemas.microsoft.com/office/drawing/2016/ink" xmlns:am3d="http://schemas.microsoft.com/office/drawing/2017/model3d" xmlns:oel="http://schemas.microsoft.com/office/2019/extlst" xmlns:r="http://schemas.openxmlformats.org/officeDocument/2006/relationships" xmlns:wp14="http://schemas.microsoft.com/office/word/2010/wordprocessingDrawing" xmlns:wp="http://schemas.openxmlformats.org/drawingml/2006/wordprocessingDrawing" xmlns:wpg="http://schemas.microsoft.com/office/word/2010/wordprocessingGroup" xmlns:wpi="http://schemas.microsoft.com/office/word/2010/wordprocessingInk" xmlns:wps="http://schemas.microsoft.com/office/word/2010/wordprocessingShape" xmlns:o="urn:schemas-microsoft-com:office:office" xmlns:v="urn:schemas-microsoft-com:vml" xmlns:w10="urn:schemas-microsoft-com:office:word" xmlns:w="http://schemas.openxmlformats.org/wordprocessingml/2006/main" xmlns:w14="http://schemas.microsoft.com/office/word/2010/wordml" xmlns:w15="http://schemas.microsoft.com/office/word/2012/wordml" xmlns:w16cex="http://schemas.microsoft.com/office/word/2018/wordml/cex" xmlns:w16cid="http://schemas.microsoft.com/office/word/2016/wordml/cid" xmlns:w16="http://schemas.microsoft.com/office/word/2018/wordml" xmlns:w16sdtdh="http://schemas.microsoft.com/office/word/2020/wordml/sdtdatahash" xmlns:w16sdtfl="http://schemas.microsoft.com/office/word/2024/wordml/sdtformatlock" xmlns:w16se="http://schemas.microsoft.com/office/word/2015/wordml/symex" xmlns:w16du="http://schemas.microsoft.com/office/word/2023/wordml/word16du" xmlns:wne="http://schemas.microsoft.com/office/word/2006/wordml" mc:Ignorable="w14 w15 w16se w16cid w16 w16cex w16sdtdh w16sdtfl w16du wp14">
+<w:footnotes xmlns:wpc="http://schemas.microsoft.com/office/word/2010/wordprocessingCanvas" xmlns:cx="http://schemas.microsoft.com/office/drawing/2014/chartex" xmlns:cx1="http://schemas.microsoft.com/office/drawing/2015/9/8/chartex" xmlns:mc="http://schemas.openxmlformats.org/markup-compatibility/2006" xmlns:o="urn:schemas-microsoft-com:office:office" xmlns:r="http://schemas.openxmlformats.org/officeDocument/2006/relationships" xmlns:m="http://schemas.openxmlformats.org/officeDocument/2006/math" xmlns:v="urn:schemas-microsoft-com:vml" xmlns:wp14="http://schemas.microsoft.com/office/word/2010/wordprocessingDrawing" xmlns:wp="http://schemas.openxmlformats.org/drawingml/2006/wordprocessingDrawing" xmlns:w10="urn:schemas-microsoft-com:office:word" xmlns:w="http://schemas.openxmlformats.org/wordprocessingml/2006/main" xmlns:w14="http://schemas.microsoft.com/office/word/2010/wordml" xmlns:w15="http://schemas.microsoft.com/office/word/2012/wordml" xmlns:w16se="http://schemas.microsoft.com/office/word/2015/wordml/symex" xmlns:wpg="http://schemas.microsoft.com/office/word/2010/wordprocessingGroup" xmlns:wpi="http://schemas.microsoft.com/office/word/2010/wordprocessingInk" xmlns:wne="http://schemas.microsoft.com/office/word/2006/wordml" xmlns:wps="http://schemas.microsoft.com/office/word/2010/wordprocessingShape" mc:Ignorable="w14 w15 w16se wp14">
   <w:footnote w:type="separator" w:id="-1">
     <w:p>
       <w:r>
@@ -2858,7 +3093,7 @@
 </file>
 
 <file path=word/styles.xml><?xml version="1.0" encoding="utf-8"?>
-<w:styles xmlns:mc="http://schemas.openxmlformats.org/markup-compatibility/2006" xmlns:r="http://schemas.openxmlformats.org/officeDocument/2006/relationships" xmlns:w="http://schemas.openxmlformats.org/wordprocessingml/2006/main" xmlns:w14="http://schemas.microsoft.com/office/word/2010/wordml" xmlns:w15="http://schemas.microsoft.com/office/word/2012/wordml" xmlns:w16cex="http://schemas.microsoft.com/office/word/2018/wordml/cex" xmlns:w16cid="http://schemas.microsoft.com/office/word/2016/wordml/cid" xmlns:w16="http://schemas.microsoft.com/office/word/2018/wordml" xmlns:w16sdtdh="http://schemas.microsoft.com/office/word/2020/wordml/sdtdatahash" xmlns:w16sdtfl="http://schemas.microsoft.com/office/word/2024/wordml/sdtformatlock" xmlns:w16se="http://schemas.microsoft.com/office/word/2015/wordml/symex" xmlns:w16du="http://schemas.microsoft.com/office/word/2023/wordml/word16du" mc:Ignorable="w14 w15 w16se w16cid w16 w16cex w16sdtdh w16sdtfl w16du">
+<w:styles xmlns:mc="http://schemas.openxmlformats.org/markup-compatibility/2006" xmlns:r="http://schemas.openxmlformats.org/officeDocument/2006/relationships" xmlns:w="http://schemas.openxmlformats.org/wordprocessingml/2006/main" xmlns:w14="http://schemas.microsoft.com/office/word/2010/wordml" xmlns:w15="http://schemas.microsoft.com/office/word/2012/wordml" xmlns:w16se="http://schemas.microsoft.com/office/word/2015/wordml/symex" mc:Ignorable="w14 w15 w16se">
   <w:docDefaults>
     <w:rPrDefault>
       <w:rPr>
@@ -2870,7 +3105,7 @@
     </w:rPrDefault>
     <w:pPrDefault/>
   </w:docDefaults>
-  <w:latentStyles w:defLockedState="0" w:defUIPriority="99" w:defSemiHidden="0" w:defUnhideWhenUsed="0" w:defQFormat="0" w:count="376">
+  <w:latentStyles w:defLockedState="0" w:defUIPriority="99" w:defSemiHidden="0" w:defUnhideWhenUsed="0" w:defQFormat="0" w:count="371">
     <w:lsdException w:name="Normal" w:uiPriority="0" w:qFormat="1"/>
     <w:lsdException w:name="heading 1" w:uiPriority="9" w:qFormat="1"/>
     <w:lsdException w:name="heading 2" w:semiHidden="1" w:uiPriority="9" w:unhideWhenUsed="1" w:qFormat="1"/>
@@ -3242,11 +3477,6 @@
     <w:lsdException w:name="List Table 5 Dark Accent 6" w:uiPriority="50"/>
     <w:lsdException w:name="List Table 6 Colorful Accent 6" w:uiPriority="51"/>
     <w:lsdException w:name="List Table 7 Colorful Accent 6" w:uiPriority="52"/>
-    <w:lsdException w:name="Mention" w:semiHidden="1" w:unhideWhenUsed="1"/>
-    <w:lsdException w:name="Smart Hyperlink" w:semiHidden="1" w:unhideWhenUsed="1"/>
-    <w:lsdException w:name="Hashtag" w:semiHidden="1" w:unhideWhenUsed="1"/>
-    <w:lsdException w:name="Unresolved Mention" w:semiHidden="1" w:unhideWhenUsed="1"/>
-    <w:lsdException w:name="Smart Link" w:semiHidden="1" w:unhideWhenUsed="1"/>
   </w:latentStyles>
   <w:style w:type="paragraph" w:default="1" w:styleId="Normal">
     <w:name w:val="Normal"/>

</xml_diff>